<commit_message>
cv: integrate academic record and confirmed career chronology
</commit_message>
<xml_diff>
--- a/cv/professional-cv.docx
+++ b/cv/professional-cv.docx
@@ -50,6 +50,15 @@
       </w:r>
     </w:p>
     <w:p>
+      <w:pPr/>
+      <w:r>
+        <w:rPr>
+          <w:b w:val="0"/>
+        </w:rPr>
+        <w:t>LinkedIn: linkedin.com/in/pasd-putthapipat-1a401940</w:t>
+      </w:r>
+    </w:p>
+    <w:p>
       <w:pPr>
         <w:pStyle w:val="Heading1"/>
       </w:pPr>
@@ -63,7 +72,7 @@
         <w:rPr>
           <w:b w:val="0"/>
         </w:rPr>
-        <w:t>Data and AI leader with experience building an analytics and products department, directing multidisciplinary AI teams, and leading data platform development across financial services and telecommunications businesses. Built the department at SCB DataX and led 30+ data scientists at True Digital Group, connecting product strategy with research, engineering, and delivery. Most recently led Data and AI Platform development at Infinitas by Krungthai. Combines expertise in data strategy and governance policy with a foundation in applied research and university departmental leadership. Brings organization-building experience, product judgment, and technical depth to enterprise data and AI leadership.</w:t>
+        <w:t>Data and AI executive with experience building analytics organizations, leading multidisciplinary teams, and establishing data foundations across financial services and telecommunications. Served as Acting Director of Data for a virtual banking initiative at Infinitas by Krungthai, leading platform setup across data engineering, architecture, and governance. A founding member of DataX, built the analytics and products department and directed AI product development. Previously led 30+ data scientists at True Digital Group. Combines organization-building experience and technical depth with university teaching in data science and business analytics, and research on decentralized data strategies for virtual banking.</w:t>
       </w:r>
     </w:p>
     <w:p>
@@ -87,7 +96,7 @@
         <w:rPr>
           <w:b/>
         </w:rPr>
-        <w:t>Career Break | August 2026 - Present</w:t>
+        <w:t>Career Break from Corporate Roles | August 2026 - Present</w:t>
       </w:r>
       <w:r>
         <w:rPr>
@@ -122,6 +131,17 @@
         <w:rPr>
           <w:b w:val="0"/>
         </w:rPr>
+      </w:r>
+    </w:p>
+    <w:p>
+      <w:pPr>
+        <w:pStyle w:val="ListBullet"/>
+      </w:pPr>
+      <w:r>
+        <w:rPr>
+          <w:b w:val="0"/>
+        </w:rPr>
+        <w:t>Served as Acting Director of Data for a virtual banking initiative, leading platform setup from inception across data engineering, data architecture, and data governance.</w:t>
       </w:r>
     </w:p>
     <w:p>
@@ -183,7 +203,7 @@
         <w:rPr>
           <w:b w:val="0"/>
         </w:rPr>
-        <w:t>Built the analytics and products department from inception.</w:t>
+        <w:t>As a founding member of DataX, the analytics subsidiary of SCB X, built the analytics organization and product team from inception.</w:t>
       </w:r>
     </w:p>
     <w:p>
@@ -206,102 +226,6 @@
           <w:b w:val="0"/>
         </w:rPr>
         <w:t>Directed the product development lifecycle from vision and roadmap through research, proof of concept, and delivery.</w:t>
-      </w:r>
-    </w:p>
-    <w:p>
-      <w:pPr>
-        <w:pStyle w:val="Heading1"/>
-      </w:pPr>
-      <w:r>
-        <w:t>Executive Capabilities</w:t>
-      </w:r>
-    </w:p>
-    <w:p>
-      <w:pPr>
-        <w:pStyle w:val="ListBullet"/>
-      </w:pPr>
-      <w:r>
-        <w:rPr>
-          <w:b w:val="0"/>
-        </w:rPr>
-      </w:r>
-      <w:r>
-        <w:rPr>
-          <w:b/>
-        </w:rPr>
-        <w:t>Organization building:</w:t>
-      </w:r>
-      <w:r>
-        <w:rPr>
-          <w:b w:val="0"/>
-        </w:rPr>
-        <w:t xml:space="preserve"> Establishing departments and leading multidisciplinary data, AI, analytics, and product teams.</w:t>
-      </w:r>
-    </w:p>
-    <w:p>
-      <w:pPr>
-        <w:pStyle w:val="ListBullet"/>
-      </w:pPr>
-      <w:r>
-        <w:rPr>
-          <w:b w:val="0"/>
-        </w:rPr>
-      </w:r>
-      <w:r>
-        <w:rPr>
-          <w:b/>
-        </w:rPr>
-        <w:t>Product strategy:</w:t>
-      </w:r>
-      <w:r>
-        <w:rPr>
-          <w:b w:val="0"/>
-        </w:rPr>
-        <w:t xml:space="preserve"> Defining product vision and roadmaps and directing development from research to delivery.</w:t>
-      </w:r>
-    </w:p>
-    <w:p>
-      <w:pPr>
-        <w:pStyle w:val="ListBullet"/>
-      </w:pPr>
-      <w:r>
-        <w:rPr>
-          <w:b w:val="0"/>
-        </w:rPr>
-      </w:r>
-      <w:r>
-        <w:rPr>
-          <w:b/>
-        </w:rPr>
-        <w:t>Data foundations:</w:t>
-      </w:r>
-      <w:r>
-        <w:rPr>
-          <w:b w:val="0"/>
-        </w:rPr>
-        <w:t xml:space="preserve"> Leading Data and AI Platform development and planning the transfer of practices across group companies.</w:t>
-      </w:r>
-    </w:p>
-    <w:p>
-      <w:pPr>
-        <w:pStyle w:val="ListBullet"/>
-      </w:pPr>
-      <w:r>
-        <w:rPr>
-          <w:b w:val="0"/>
-        </w:rPr>
-      </w:r>
-      <w:r>
-        <w:rPr>
-          <w:b/>
-        </w:rPr>
-        <w:t>Business applications:</w:t>
-      </w:r>
-      <w:r>
-        <w:rPr>
-          <w:b w:val="0"/>
-        </w:rPr>
-        <w:t xml:space="preserve"> Analytics products for location insights, digital behavior, competitive analysis, and credit assessment.</w:t>
       </w:r>
     </w:p>
     <w:p>
@@ -355,7 +279,7 @@
         <w:rPr>
           <w:b/>
         </w:rPr>
-        <w:t>Head of Product, Analytics Product | April 2021 - October 2021</w:t>
+        <w:t>Head of Product, Analytics Product | May 2021 - October 2021</w:t>
       </w:r>
       <w:r>
         <w:rPr>
@@ -387,6 +311,17 @@
     </w:p>
     <w:p>
       <w:pPr>
+        <w:pStyle w:val="ListBullet"/>
+      </w:pPr>
+      <w:r>
+        <w:rPr>
+          <w:b w:val="0"/>
+        </w:rPr>
+        <w:t>Partnered with the Analytics Platform team on software development to bring analytics products to market.</w:t>
+      </w:r>
+    </w:p>
+    <w:p>
+      <w:pPr>
         <w:keepNext/>
       </w:pPr>
       <w:r>
@@ -398,7 +333,7 @@
         <w:rPr>
           <w:b/>
         </w:rPr>
-        <w:t>Head of Product Development (Data Science), Analytics Product | June 2019 - March 2021</w:t>
+        <w:t>Head of Product Development (Data Science), Analytics Product | June 2019 - April 2021</w:t>
       </w:r>
       <w:r>
         <w:rPr>
@@ -419,7 +354,7 @@
         <w:rPr>
           <w:b/>
         </w:rPr>
-        <w:t>Acting Head of Product | October 2020 - March 2021</w:t>
+        <w:t>Acting Head of Product | October 2020 - April 2021</w:t>
       </w:r>
       <w:r>
         <w:rPr>
@@ -615,7 +550,233 @@
         <w:pageBreakBefore/>
       </w:pPr>
       <w:r>
-        <w:t>Academic Leadership and Teaching</w:t>
+        <w:t>Adjunct Teaching and Professional Contribution</w:t>
+      </w:r>
+    </w:p>
+    <w:p>
+      <w:pPr>
+        <w:pStyle w:val="Heading2"/>
+      </w:pPr>
+      <w:r>
+        <w:t>Panyapiwat Institute of Management</w:t>
+      </w:r>
+    </w:p>
+    <w:p>
+      <w:pPr>
+        <w:keepNext/>
+      </w:pPr>
+      <w:r>
+        <w:rPr>
+          <w:b w:val="0"/>
+        </w:rPr>
+      </w:r>
+      <w:r>
+        <w:rPr>
+          <w:b/>
+        </w:rPr>
+        <w:t>Adjunct Faculty Member | 2021 - Present</w:t>
+      </w:r>
+      <w:r>
+        <w:rPr>
+          <w:b w:val="0"/>
+        </w:rPr>
+      </w:r>
+    </w:p>
+    <w:p>
+      <w:pPr>
+        <w:pStyle w:val="ListBullet"/>
+      </w:pPr>
+      <w:r>
+        <w:rPr>
+          <w:b w:val="0"/>
+        </w:rPr>
+        <w:t>Teach IB5172704, Data Analytics and Governance for Business Decision; previously IB62709, Big Data Analytics for Business Decision.</w:t>
+      </w:r>
+    </w:p>
+    <w:p>
+      <w:pPr>
+        <w:pStyle w:val="ListBullet"/>
+      </w:pPr>
+      <w:r>
+        <w:rPr>
+          <w:b w:val="0"/>
+        </w:rPr>
+        <w:t>Taught MI 62212, Big Data Analytics for Consumer Behavior, semester 1/2021.</w:t>
+      </w:r>
+    </w:p>
+    <w:p>
+      <w:pPr>
+        <w:pStyle w:val="ListBullet"/>
+      </w:pPr>
+      <w:r>
+        <w:rPr>
+          <w:b w:val="0"/>
+        </w:rPr>
+        <w:t>Served as Responsible Faculty Member, 2019-2020.</w:t>
+      </w:r>
+    </w:p>
+    <w:p>
+      <w:pPr>
+        <w:pStyle w:val="Heading2"/>
+      </w:pPr>
+      <w:r>
+        <w:t>King Mongkut's University of Technology North Bangkok</w:t>
+      </w:r>
+    </w:p>
+    <w:p>
+      <w:pPr>
+        <w:keepNext/>
+      </w:pPr>
+      <w:r>
+        <w:rPr>
+          <w:b w:val="0"/>
+        </w:rPr>
+      </w:r>
+      <w:r>
+        <w:rPr>
+          <w:b/>
+        </w:rPr>
+        <w:t>Adjunct Faculty Member | 2020 - Present</w:t>
+      </w:r>
+      <w:r>
+        <w:rPr>
+          <w:b w:val="0"/>
+        </w:rPr>
+      </w:r>
+    </w:p>
+    <w:p>
+      <w:pPr/>
+      <w:r>
+        <w:rPr>
+          <w:b w:val="0"/>
+        </w:rPr>
+        <w:t>Department of Applied Statistics, Faculty of Applied Science.</w:t>
+      </w:r>
+    </w:p>
+    <w:p>
+      <w:pPr>
+        <w:pStyle w:val="ListBullet"/>
+      </w:pPr>
+      <w:r>
+        <w:rPr>
+          <w:b w:val="0"/>
+        </w:rPr>
+        <w:t>Teach 040563107, Tools for Statistical Data Science, and 040563105, Statistical Analysis for Big Data.</w:t>
+      </w:r>
+    </w:p>
+    <w:p>
+      <w:pPr>
+        <w:pStyle w:val="Heading2"/>
+      </w:pPr>
+      <w:r>
+        <w:t>Thai-Nichi Institute of Technology</w:t>
+      </w:r>
+    </w:p>
+    <w:p>
+      <w:pPr>
+        <w:keepNext/>
+      </w:pPr>
+      <w:r>
+        <w:rPr>
+          <w:b w:val="0"/>
+        </w:rPr>
+      </w:r>
+      <w:r>
+        <w:rPr>
+          <w:b/>
+        </w:rPr>
+        <w:t>Adjunct Faculty Member | Semester 1/2020</w:t>
+      </w:r>
+      <w:r>
+        <w:rPr>
+          <w:b w:val="0"/>
+        </w:rPr>
+      </w:r>
+    </w:p>
+    <w:p>
+      <w:pPr/>
+      <w:r>
+        <w:rPr>
+          <w:b w:val="0"/>
+        </w:rPr>
+        <w:t>Digital Engineering, International Program.</w:t>
+      </w:r>
+    </w:p>
+    <w:p>
+      <w:pPr>
+        <w:pStyle w:val="ListBullet"/>
+      </w:pPr>
+      <w:r>
+        <w:rPr>
+          <w:b w:val="0"/>
+        </w:rPr>
+        <w:t>Taught DGE-306, Big Data Engineering.</w:t>
+      </w:r>
+    </w:p>
+    <w:p>
+      <w:pPr>
+        <w:pStyle w:val="Heading2"/>
+      </w:pPr>
+      <w:r>
+        <w:t>Prince of Songkla University Phuket Campus</w:t>
+      </w:r>
+    </w:p>
+    <w:p>
+      <w:pPr>
+        <w:keepNext/>
+      </w:pPr>
+      <w:r>
+        <w:rPr>
+          <w:b w:val="0"/>
+        </w:rPr>
+      </w:r>
+      <w:r>
+        <w:rPr>
+          <w:b/>
+        </w:rPr>
+        <w:t>Adjunct Faculty Member | Semester 1/2017</w:t>
+      </w:r>
+      <w:r>
+        <w:rPr>
+          <w:b w:val="0"/>
+        </w:rPr>
+      </w:r>
+    </w:p>
+    <w:p>
+      <w:pPr>
+        <w:pStyle w:val="ListBullet"/>
+      </w:pPr>
+      <w:r>
+        <w:rPr>
+          <w:b w:val="0"/>
+        </w:rPr>
+        <w:t>Taught EB976-302, E-Payment.</w:t>
+      </w:r>
+    </w:p>
+    <w:p>
+      <w:pPr>
+        <w:pStyle w:val="Heading1"/>
+      </w:pPr>
+      <w:r>
+        <w:t>Selected Guest Speaking</w:t>
+      </w:r>
+    </w:p>
+    <w:p>
+      <w:pPr/>
+      <w:r>
+        <w:rPr>
+          <w:b w:val="0"/>
+        </w:rPr>
+        <w:t>Guest-speaking engagements at KMITL, NIDA, and True Digital Academy.</w:t>
+      </w:r>
+    </w:p>
+    <w:p>
+      <w:pPr>
+        <w:pStyle w:val="Heading1"/>
+        <w:pageBreakBefore/>
+      </w:pPr>
+      <w:r>
+        <w:t>Academic Leadership and Earlier Experience</w:t>
       </w:r>
     </w:p>
     <w:p>
@@ -639,55 +800,12 @@
         <w:rPr>
           <w:b/>
         </w:rPr>
-        <w:t>Vincent Mary School of Engineering | Bangkok, Thailand</w:t>
+        <w:t>Vincent Mary School of Engineering | Lecturer, Computer Engineering | June 2006 - April 2018</w:t>
       </w:r>
       <w:r>
         <w:rPr>
           <w:b w:val="0"/>
         </w:rPr>
-      </w:r>
-    </w:p>
-    <w:p>
-      <w:pPr>
-        <w:keepNext/>
-      </w:pPr>
-      <w:r>
-        <w:rPr>
-          <w:b w:val="0"/>
-        </w:rPr>
-      </w:r>
-      <w:r>
-        <w:rPr>
-          <w:b/>
-        </w:rPr>
-        <w:t>Lecturer, Computer Engineering | June 2006 - April 2018</w:t>
-      </w:r>
-      <w:r>
-        <w:rPr>
-          <w:b w:val="0"/>
-        </w:rPr>
-      </w:r>
-    </w:p>
-    <w:p>
-      <w:pPr>
-        <w:pStyle w:val="ListBullet"/>
-      </w:pPr>
-      <w:r>
-        <w:rPr>
-          <w:b w:val="0"/>
-        </w:rPr>
-        <w:t>Taught Computer Engineering and Electrical Engineering courses.</w:t>
-      </w:r>
-    </w:p>
-    <w:p>
-      <w:pPr>
-        <w:pStyle w:val="ListBullet"/>
-      </w:pPr>
-      <w:r>
-        <w:rPr>
-          <w:b w:val="0"/>
-        </w:rPr>
-        <w:t>Pursued applied research in IoT platforms, smart-device data analysis, and Thai-language social media analytics.</w:t>
       </w:r>
     </w:p>
     <w:p>
@@ -724,36 +842,7 @@
         <w:rPr>
           <w:b/>
         </w:rPr>
-        <w:t>Acting Chairperson, Aeronautic Engineering | February 2015 - September 2016</w:t>
-      </w:r>
-      <w:r>
-        <w:rPr>
-          <w:b w:val="0"/>
-        </w:rPr>
-      </w:r>
-    </w:p>
-    <w:p>
-      <w:pPr>
-        <w:pStyle w:val="Heading1"/>
-      </w:pPr>
-      <w:r>
-        <w:t>Selected Applied Research</w:t>
-      </w:r>
-    </w:p>
-    <w:p>
-      <w:pPr>
-        <w:keepNext/>
-      </w:pPr>
-      <w:r>
-        <w:rPr>
-          <w:b w:val="0"/>
-        </w:rPr>
-      </w:r>
-      <w:r>
-        <w:rPr>
-          <w:b/>
-        </w:rPr>
-        <w:t>Assumption University | May 2013 - April 2018</w:t>
+        <w:t>Acting Chairperson, Aeronautic Engineering | February 2016 - September 2016</w:t>
       </w:r>
       <w:r>
         <w:rPr>
@@ -769,18 +858,7 @@
         <w:rPr>
           <w:b w:val="0"/>
         </w:rPr>
-      </w:r>
-      <w:r>
-        <w:rPr>
-          <w:b/>
-        </w:rPr>
-        <w:t>Open IoT platform:</w:t>
-      </w:r>
-      <w:r>
-        <w:rPr>
-          <w:b w:val="0"/>
-        </w:rPr>
-        <w:t xml:space="preserve"> Developed an open platform using Raspberry Pi, with prototype designs for access control, a voice-controlled communication gateway, and supermarket customer counting.</w:t>
+        <w:t>Taught algorithm design, programming, digital logic, embedded systems, microprocessor and interfacing laboratories, discrete mathematics, and cloud computing.</w:t>
       </w:r>
     </w:p>
     <w:p>
@@ -791,18 +869,7 @@
         <w:rPr>
           <w:b w:val="0"/>
         </w:rPr>
-      </w:r>
-      <w:r>
-        <w:rPr>
-          <w:b/>
-        </w:rPr>
-        <w:t>Smart-device analytics:</w:t>
-      </w:r>
-      <w:r>
-        <w:rPr>
-          <w:b w:val="0"/>
-        </w:rPr>
-        <w:t xml:space="preserve"> Analyzed temperature and power sensor data from smart devices using big-data approaches.</w:t>
+        <w:t>Served on the School of Engineering Quality Assurance Team, May 2013 - April 2018, and as Responsible Faculty Member for Computer Engineering, August 2017 - April 2018, and Aeronautic Engineering, February 2015 - July 2017.</w:t>
       </w:r>
     </w:p>
     <w:p>
@@ -813,26 +880,18 @@
         <w:rPr>
           <w:b w:val="0"/>
         </w:rPr>
+        <w:t>Held academic-advising, student-development, and international-relations coordination appointments.</w:t>
       </w:r>
-      <w:r>
-        <w:rPr>
-          <w:b/>
-        </w:rPr>
-        <w:t>Social media analytics:</w:t>
-      </w:r>
+    </w:p>
+    <w:p>
+      <w:pPr>
+        <w:pStyle w:val="ListBullet"/>
+      </w:pPr>
       <w:r>
         <w:rPr>
           <w:b w:val="0"/>
         </w:rPr>
-        <w:t xml:space="preserve"> Conducted Thai-language social network trend analysis using Google Cloud Platform.</w:t>
-      </w:r>
-    </w:p>
-    <w:p>
-      <w:pPr>
-        <w:pStyle w:val="Heading1"/>
-      </w:pPr>
-      <w:r>
-        <w:t>Industry Research and Advisory Experience</w:t>
+        <w:t>Conducted applied research in open IoT platforms, access-control prototypes, sensor analytics, and Thai-language social media analysis using Google Cloud Platform.</w:t>
       </w:r>
     </w:p>
     <w:p>
@@ -840,7 +899,7 @@
         <w:pStyle w:val="Heading2"/>
       </w:pPr>
       <w:r>
-        <w:t>Saijo Denki International Co., Ltd.</w:t>
+        <w:t>Saijo Denki International Co Ltd</w:t>
       </w:r>
     </w:p>
     <w:p>
@@ -872,18 +931,7 @@
         <w:rPr>
           <w:b w:val="0"/>
         </w:rPr>
-        <w:t>Conducted research for product and service development within an in-house startup unit.</w:t>
-      </w:r>
-    </w:p>
-    <w:p>
-      <w:pPr>
-        <w:pStyle w:val="ListBullet"/>
-      </w:pPr>
-      <w:r>
-        <w:rPr>
-          <w:b w:val="0"/>
-        </w:rPr>
-        <w:t>Combined technical consulting with co-principal-investigator work in online-to-offline services, IoT devices, and mobile network applications.</w:t>
+        <w:t>Conducted product and service research within an in-house startup unit, covering online-to-offline services, connected devices, and mobile network applications.</w:t>
       </w:r>
     </w:p>
     <w:p>
@@ -917,13 +965,44 @@
     </w:p>
     <w:p>
       <w:pPr>
-        <w:pStyle w:val="ListBullet"/>
+        <w:keepNext/>
       </w:pPr>
       <w:r>
         <w:rPr>
           <w:b w:val="0"/>
         </w:rPr>
-        <w:t>Conducted computer engineering and telecommunications engineering research across multiple projects.</w:t>
+      </w:r>
+      <w:r>
+        <w:rPr>
+          <w:b/>
+        </w:rPr>
+        <w:t>Graduate Assistant, Electrical and Computer Engineering | September 2010 - April 2013</w:t>
+      </w:r>
+      <w:r>
+        <w:rPr>
+          <w:b w:val="0"/>
+        </w:rPr>
+      </w:r>
+    </w:p>
+    <w:p>
+      <w:pPr>
+        <w:keepNext/>
+      </w:pPr>
+      <w:r>
+        <w:rPr>
+          <w:b w:val="0"/>
+        </w:rPr>
+      </w:r>
+      <w:r>
+        <w:rPr>
+          <w:b/>
+        </w:rPr>
+        <w:t>Graduate Assistant, Telecommunications and Information Technology | August 2008 - August 2010</w:t>
+      </w:r>
+      <w:r>
+        <w:rPr>
+          <w:b w:val="0"/>
+        </w:rPr>
       </w:r>
     </w:p>
     <w:p>
@@ -934,7 +1013,100 @@
         <w:rPr>
           <w:b w:val="0"/>
         </w:rPr>
-        <w:t>Contributed as both a research team lead and a team member.</w:t>
+        <w:t>Conducted computer engineering and telecommunications research as a team lead and team member.</w:t>
+      </w:r>
+    </w:p>
+    <w:p>
+      <w:pPr>
+        <w:pStyle w:val="ListBullet"/>
+      </w:pPr>
+      <w:r>
+        <w:rPr>
+          <w:b w:val="0"/>
+        </w:rPr>
+        <w:t>Coordinated assessment surveys, comprehensive examinations, and portfolios for undergraduate engineering programs in ABET-related work with the Undergraduate Program Director.</w:t>
+      </w:r>
+    </w:p>
+    <w:p>
+      <w:pPr>
+        <w:pStyle w:val="ListBullet"/>
+      </w:pPr>
+      <w:r>
+        <w:rPr>
+          <w:b w:val="0"/>
+        </w:rPr>
+        <w:t>Contributed to undergraduate and graduate curriculum development and taught Electronic I and Integrated Circuits laboratories in 2011-2012.</w:t>
+      </w:r>
+    </w:p>
+    <w:p>
+      <w:pPr>
+        <w:pStyle w:val="Heading1"/>
+      </w:pPr>
+      <w:r>
+        <w:t>Earlier Appointments</w:t>
+      </w:r>
+    </w:p>
+    <w:p>
+      <w:pPr>
+        <w:pStyle w:val="ListBullet"/>
+      </w:pPr>
+      <w:r>
+        <w:rPr>
+          <w:b w:val="0"/>
+        </w:rPr>
+      </w:r>
+      <w:r>
+        <w:rPr>
+          <w:b/>
+        </w:rPr>
+        <w:t>Research Internship | HEIG-VD | December 2007 - March 2008.</w:t>
+      </w:r>
+      <w:r>
+        <w:rPr>
+          <w:b w:val="0"/>
+        </w:rPr>
+      </w:r>
+    </w:p>
+    <w:p>
+      <w:pPr>
+        <w:pStyle w:val="ListBullet"/>
+      </w:pPr>
+      <w:r>
+        <w:rPr>
+          <w:b w:val="0"/>
+        </w:rPr>
+      </w:r>
+      <w:r>
+        <w:rPr>
+          <w:b/>
+        </w:rPr>
+        <w:t>IT Consultant | Santonino Co., Ltd., Thailand | January 2003 - June 2008.</w:t>
+      </w:r>
+      <w:r>
+        <w:rPr>
+          <w:b w:val="0"/>
+        </w:rPr>
+      </w:r>
+    </w:p>
+    <w:p>
+      <w:pPr>
+        <w:pStyle w:val="ListBullet"/>
+      </w:pPr>
+      <w:r>
+        <w:rPr>
+          <w:b w:val="0"/>
+        </w:rPr>
+      </w:r>
+      <w:r>
+        <w:rPr>
+          <w:b/>
+        </w:rPr>
+        <w:t>Teaching Assistant | Assumption University | June 2003 - September 2005.</w:t>
+      </w:r>
+      <w:r>
+        <w:rPr>
+          <w:b w:val="0"/>
+        </w:rPr>
       </w:r>
     </w:p>
     <w:p>
@@ -982,7 +1154,37 @@
         <w:rPr>
           <w:b w:val="0"/>
         </w:rPr>
-        <w:t>Specialization in Telecommunications and Networking.</w:t>
+        <w:t>Specialization in Telecommunications and Networking. Dissertation: Lightweight Middleware for SDR Inter-components Communication. Supervisor: Jean H. Andrian. Full financial graduate assistantship.</w:t>
+      </w:r>
+    </w:p>
+    <w:p>
+      <w:pPr>
+        <w:keepNext/>
+      </w:pPr>
+      <w:r>
+        <w:rPr>
+          <w:b w:val="0"/>
+        </w:rPr>
+      </w:r>
+      <w:r>
+        <w:rPr>
+          <w:b/>
+        </w:rPr>
+        <w:t>Master of Science in Computer Engineering</w:t>
+      </w:r>
+      <w:r>
+        <w:rPr>
+          <w:b w:val="0"/>
+        </w:rPr>
+      </w:r>
+    </w:p>
+    <w:p>
+      <w:pPr/>
+      <w:r>
+        <w:rPr>
+          <w:b w:val="0"/>
+        </w:rPr>
+        <w:t>Florida International University, Miami, Florida, United States | 2012</w:t>
       </w:r>
     </w:p>
     <w:p>
@@ -1016,6 +1218,15 @@
       </w:r>
     </w:p>
     <w:p>
+      <w:pPr/>
+      <w:r>
+        <w:rPr>
+          <w:b w:val="0"/>
+        </w:rPr>
+        <w:t>Full scholarship from Assumption University.</w:t>
+      </w:r>
+    </w:p>
+    <w:p>
       <w:pPr>
         <w:pStyle w:val="Heading1"/>
       </w:pPr>
@@ -1036,13 +1247,13 @@
         <w:rPr>
           <w:b/>
         </w:rPr>
-        <w:t>Data and AI leadership:</w:t>
+        <w:t>Strategy and organization:</w:t>
       </w:r>
       <w:r>
         <w:rPr>
           <w:b w:val="0"/>
         </w:rPr>
-        <w:t xml:space="preserve"> Department building, cross-functional leadership, AI and analytics product development, product vision, roadmaps, research and development, and Data and AI Platform development.</w:t>
+        <w:t xml:space="preserve"> Data and AI strategy, department building, cross-functional leadership, product vision and roadmaps, and research and development.</w:t>
       </w:r>
     </w:p>
     <w:p>
@@ -1058,13 +1269,35 @@
         <w:rPr>
           <w:b/>
         </w:rPr>
-        <w:t>Data governance:</w:t>
+        <w:t>Data foundations:</w:t>
       </w:r>
       <w:r>
         <w:rPr>
           <w:b w:val="0"/>
         </w:rPr>
-        <w:t xml:space="preserve"> Data strategy, data management and governance policy, and PDPA compliance.</w:t>
+        <w:t xml:space="preserve"> Data and AI platforms, data engineering, data architecture, governance policy, data privacy, and PDPA compliance.</w:t>
+      </w:r>
+    </w:p>
+    <w:p>
+      <w:pPr>
+        <w:pStyle w:val="ListBullet"/>
+      </w:pPr>
+      <w:r>
+        <w:rPr>
+          <w:b w:val="0"/>
+        </w:rPr>
+      </w:r>
+      <w:r>
+        <w:rPr>
+          <w:b/>
+        </w:rPr>
+        <w:t>Business domains:</w:t>
+      </w:r>
+      <w:r>
+        <w:rPr>
+          <w:b w:val="0"/>
+        </w:rPr>
+        <w:t xml:space="preserve"> Virtual banking, financial services, telecommunications analytics, credit analytics, digital behavior, and university engineering education.</w:t>
       </w:r>
     </w:p>
     <w:p>
@@ -1086,29 +1319,7 @@
         <w:rPr>
           <w:b w:val="0"/>
         </w:rPr>
-        <w:t xml:space="preserve"> Company IT direction, IT purchasing and maintenance consulting, telecommunications legal advisement, industrial standards, and public policy.</w:t>
-      </w:r>
-    </w:p>
-    <w:p>
-      <w:pPr>
-        <w:pStyle w:val="ListBullet"/>
-      </w:pPr>
-      <w:r>
-        <w:rPr>
-          <w:b w:val="0"/>
-        </w:rPr>
-      </w:r>
-      <w:r>
-        <w:rPr>
-          <w:b/>
-        </w:rPr>
-        <w:t>Business domains:</w:t>
-      </w:r>
-      <w:r>
-        <w:rPr>
-          <w:b w:val="0"/>
-        </w:rPr>
-        <w:t xml:space="preserve"> Financial services, telecommunications analytics, credit analytics, digital behavior, IoT products, and university engineering education.</w:t>
+        <w:t xml:space="preserve"> IT direction and procurement advisory, telecommunications public policy, industrial standards, and legal advisement.</w:t>
       </w:r>
     </w:p>
     <w:p>
@@ -1204,7 +1415,7 @@
         <w:rPr>
           <w:b w:val="0"/>
         </w:rPr>
-        <w:t xml:space="preserve"> Embedded systems, IoT, telecommunications and networking, sensor analytics, and cloud computing.</w:t>
+        <w:t xml:space="preserve"> Embedded systems, IoT, telecommunications and networking, software-defined radio, and sensor analytics.</w:t>
       </w:r>
     </w:p>
     <w:p>
@@ -1212,7 +1423,25 @@
         <w:pStyle w:val="Heading1"/>
       </w:pPr>
       <w:r>
-        <w:t>Teaching Subject Areas</w:t>
+        <w:t>Academic Quality Assurance Experience</w:t>
+      </w:r>
+    </w:p>
+    <w:p>
+      <w:pPr/>
+      <w:r>
+        <w:rPr>
+          <w:b w:val="0"/>
+        </w:rPr>
+        <w:t>US ABET; Thailand TQF, TPQI, MUA, and ONESQA.</w:t>
+      </w:r>
+    </w:p>
+    <w:p>
+      <w:pPr>
+        <w:pStyle w:val="Heading1"/>
+        <w:pageBreakBefore/>
+      </w:pPr>
+      <w:r>
+        <w:t>Selected Publications</w:t>
       </w:r>
     </w:p>
     <w:p>
@@ -1228,13 +1457,13 @@
         <w:rPr>
           <w:b/>
         </w:rPr>
-        <w:t>Algorithm design:</w:t>
+        <w:t>2025:</w:t>
       </w:r>
       <w:r>
         <w:rPr>
           <w:b w:val="0"/>
         </w:rPr>
-        <w:t xml:space="preserve"> Computer Engineering teaching experience at Assumption University.</w:t>
+        <w:t xml:space="preserve"> W. A. Pongpech and P. Putthapipat. “Framework for Decentralized Data Strategies in Virtual Banking: Navigating Scalability, Innovation, and Regulatory Challenges in Thailand.” Proceedings of the 15th International Conference on Cloud Computing and Services Science (CLOSER), pp. 111-118. DOI: 10.5220/0013194500003950.</w:t>
       </w:r>
     </w:p>
     <w:p>
@@ -1250,13 +1479,13 @@
         <w:rPr>
           <w:b/>
         </w:rPr>
-        <w:t>Embedded systems and IoT:</w:t>
+        <w:t>2019:</w:t>
       </w:r>
       <w:r>
         <w:rPr>
           <w:b w:val="0"/>
         </w:rPr>
-        <w:t xml:space="preserve"> Engineering teaching and applied platform and prototype research.</w:t>
+        <w:t xml:space="preserve"> S. Simargool, P. Putthapipat, W. Threevithayanon, and S. Patumtaewapibal. “Thai Social Media Trend Analysis using Big Data Feature on Cloud Computing.” RSU International Research Conference, Bangkok, pp. 375-383.</w:t>
       </w:r>
     </w:p>
     <w:p>
@@ -1272,13 +1501,123 @@
         <w:rPr>
           <w:b/>
         </w:rPr>
-        <w:t>Cloud computing:</w:t>
+        <w:t>2018:</w:t>
       </w:r>
       <w:r>
         <w:rPr>
           <w:b w:val="0"/>
         </w:rPr>
-        <w:t xml:space="preserve"> University teaching and applied social media analysis using Google Cloud Platform.</w:t>
+        <w:t xml:space="preserve"> T. Parthornratt, D. Kitsawat, P. Putthapipat, and P. Koronjaruwat. “A Smart Home Automation Via Facebook Chatbot and Raspberry Pi.” 2nd International Conference on Engineering Innovation (ICEI), Bangkok, pp. 52-56.</w:t>
+      </w:r>
+    </w:p>
+    <w:p>
+      <w:pPr>
+        <w:pStyle w:val="ListBullet"/>
+      </w:pPr>
+      <w:r>
+        <w:rPr>
+          <w:b w:val="0"/>
+        </w:rPr>
+      </w:r>
+      <w:r>
+        <w:rPr>
+          <w:b/>
+        </w:rPr>
+        <w:t>2018:</w:t>
+      </w:r>
+      <w:r>
+        <w:rPr>
+          <w:b w:val="0"/>
+        </w:rPr>
+        <w:t xml:space="preserve"> P. Putthapipat, C. Woralert, and P. Sirinimnuankul. “Speech Recognition Gateway for Home Automation on Open Platform.” International Conference on Electronics, Information, and Communications (ICEIC), United States.</w:t>
+      </w:r>
+    </w:p>
+    <w:p>
+      <w:pPr>
+        <w:pStyle w:val="ListBullet"/>
+      </w:pPr>
+      <w:r>
+        <w:rPr>
+          <w:b w:val="0"/>
+        </w:rPr>
+      </w:r>
+      <w:r>
+        <w:rPr>
+          <w:b/>
+        </w:rPr>
+        <w:t>2017:</w:t>
+      </w:r>
+      <w:r>
+        <w:rPr>
+          <w:b w:val="0"/>
+        </w:rPr>
+        <w:t xml:space="preserve"> P. Putthapipat, T. Pisanprechatam, and W. Chesdavanijikul. “A PiFrame Home Automation in Action: Case Study on Distributed Access Control Solution.” International Conference on Electronics, Information, and Communications (ICEIC), Phuket, Thailand.</w:t>
+      </w:r>
+    </w:p>
+    <w:p>
+      <w:pPr>
+        <w:pStyle w:val="ListBullet"/>
+      </w:pPr>
+      <w:r>
+        <w:rPr>
+          <w:b w:val="0"/>
+        </w:rPr>
+      </w:r>
+      <w:r>
+        <w:rPr>
+          <w:b/>
+        </w:rPr>
+        <w:t>2016:</w:t>
+      </w:r>
+      <w:r>
+        <w:rPr>
+          <w:b w:val="0"/>
+        </w:rPr>
+        <w:t xml:space="preserve"> P. Putthapipat, J. H. Andrian, and C. Liu. “Studies on Inter-component Communication Latency based on Variation Number of Components and Packet size in SDR-SCA Waveform Application.” IJCSE, vol. 12, no. 1, pp. 65-72. DOI: 10.1504/IJCSE.2016.074564.</w:t>
+      </w:r>
+    </w:p>
+    <w:p>
+      <w:pPr>
+        <w:pStyle w:val="ListBullet"/>
+      </w:pPr>
+      <w:r>
+        <w:rPr>
+          <w:b w:val="0"/>
+        </w:rPr>
+      </w:r>
+      <w:r>
+        <w:rPr>
+          <w:b/>
+        </w:rPr>
+        <w:t>2016:</w:t>
+      </w:r>
+      <w:r>
+        <w:rPr>
+          <w:b w:val="0"/>
+        </w:rPr>
+        <w:t xml:space="preserve"> P. Putthapipat and K. Techakittiroj. “PiFrame: A framework for home automation platform on the full feature OS.” International Conference on Electronics, Information, and Communications (ICEIC), pp. 1-4. DOI: 10.1109/ELINFOCOM.2016.7562978.</w:t>
+      </w:r>
+    </w:p>
+    <w:p>
+      <w:pPr>
+        <w:pStyle w:val="ListBullet"/>
+      </w:pPr>
+      <w:r>
+        <w:rPr>
+          <w:b w:val="0"/>
+        </w:rPr>
+      </w:r>
+      <w:r>
+        <w:rPr>
+          <w:b/>
+        </w:rPr>
+        <w:t>2010:</w:t>
+      </w:r>
+      <w:r>
+        <w:rPr>
+          <w:b w:val="0"/>
+        </w:rPr>
+        <w:t xml:space="preserve"> X. Jin, P. Putthapipat, D. Pan, N. Pissinou, and S. K. Makki. “Unpredictable Software-based Attestation Solution for node compromise detection in mobile WSN.” IEEE Globecom Workshops, pp. 2059-2064. DOI: 10.1109/GLOCOMW.2010.5700307.</w:t>
       </w:r>
     </w:p>
     <w:sectPr>

</xml_diff>

<commit_message>
cv: add Mahidol ICT adjunct appointment from September 2026
</commit_message>
<xml_diff>
--- a/cv/professional-cv.docx
+++ b/cv/professional-cv.docx
@@ -551,6 +551,44 @@
       </w:pPr>
       <w:r>
         <w:t>Adjunct Teaching and Professional Contribution</w:t>
+      </w:r>
+    </w:p>
+    <w:p>
+      <w:pPr>
+        <w:pStyle w:val="Heading2"/>
+      </w:pPr>
+      <w:r>
+        <w:t>Mahidol University</w:t>
+      </w:r>
+    </w:p>
+    <w:p>
+      <w:pPr>
+        <w:keepNext/>
+      </w:pPr>
+      <w:r>
+        <w:rPr>
+          <w:b w:val="0"/>
+        </w:rPr>
+      </w:r>
+      <w:r>
+        <w:rPr>
+          <w:b/>
+        </w:rPr>
+        <w:t>Adjunct Faculty Member | September 2026 - Present</w:t>
+      </w:r>
+      <w:r>
+        <w:rPr>
+          <w:b w:val="0"/>
+        </w:rPr>
+      </w:r>
+    </w:p>
+    <w:p>
+      <w:pPr/>
+      <w:r>
+        <w:rPr>
+          <w:b w:val="0"/>
+        </w:rPr>
+        <w:t>ICT program.</w:t>
       </w:r>
     </w:p>
     <w:p>

</xml_diff>